<commit_message>
Align risk band cut-offs with the dashboard (High is 60 and above)
Co-Authored-By: Claude Opus 5.5 <noreply@anthropic.com>
</commit_message>
<xml_diff>
--- a/reports/Telecom-Churn-Retention-Analysis-Report.docx
+++ b/reports/Telecom-Churn-Retention-Analysis-Report.docx
@@ -6286,7 +6286,7 @@
               <w:rPr>
                 <w:sz w:val="19"/>
               </w:rPr>
-              <w:t>2,276</w:t>
+              <w:t>2,279</w:t>
             </w:r>
           </w:p>
         </w:tc>
@@ -6305,7 +6305,7 @@
               <w:rPr>
                 <w:sz w:val="19"/>
               </w:rPr>
-              <w:t>57.1%</w:t>
+              <w:t>57.0%</w:t>
             </w:r>
           </w:p>
         </w:tc>
@@ -6386,7 +6386,7 @@
               <w:rPr>
                 <w:sz w:val="19"/>
               </w:rPr>
-              <w:t>25.6%</w:t>
+              <w:t>25.5%</w:t>
             </w:r>
           </w:p>
         </w:tc>
@@ -6444,7 +6444,7 @@
               <w:rPr>
                 <w:sz w:val="19"/>
               </w:rPr>
-              <w:t>3,221</w:t>
+              <w:t>3,218</w:t>
             </w:r>
           </w:p>
         </w:tc>

</xml_diff>